<commit_message>
Ch1: model-not-blood legibility beat; Ch4: overnight recovery cue + shared-calibration sabotage mechanism
</commit_message>
<xml_diff>
--- a/manuscript/chapter-04-mutual-stabilization.docx
+++ b/manuscript/chapter-04-mutual-stabilization.docx
@@ -50,6 +50,11 @@
     <w:p>
       <w:r>
         <w:t>RECOVERY INTERVAL COMPLETE. MANUAL OBSERVATION REQUIRED.</w:t>
+      </w:r>
+    </w:p>
+    <w:p>
+      <w:r>
+        <w:t>The four representatives returned from their overnight recovery and took their stations as the monitoring room came back online.</w:t>
       </w:r>
     </w:p>
     <w:p>
@@ -164,7 +169,7 @@
     </w:p>
     <w:p>
       <w:r>
-        <w:t>Before Elara could answer, a warning chime rang out from the adjacent Ashoka console. The tampering had spread beyond her station: with the thresholds pinned at maximum, the whole grid had turned twitchy, and a flicker in the chamber now sounded like a breach.</w:t>
+        <w:t>Before Elara could answer, a warning chime rang out from the adjacent Ashoka console. The sensitivity ceiling was not a local setting. It lived in the shared alert calibration that every station inherited, and whoever had raised it through her console had raised it for the entire room. With the thresholds pinned at maximum, the whole grid had turned twitchy, and a flicker in the chamber now sounded like a breach.</w:t>
       </w:r>
     </w:p>
     <w:p>

</xml_diff>